<commit_message>
docs: close SSRP project and prepare CWRU submission
</commit_message>
<xml_diff>
--- a/docs/research/final/ssrp_final_paper_2026-08-11.docx
+++ b/docs/research/final/ssrp_final_paper_2026-08-11.docx
@@ -135,6 +135,28 @@
           <w:sz w:val="22"/>
         </w:rPr>
         <w:t>Prepared: August 11, 2026</w:t>
+      </w:r>
+      <w:r>
+        <w:rPr>
+          <w:rFonts w:ascii="Calibri" w:hAnsi="Calibri"/>
+          <w:color w:val="000000"/>
+          <w:sz w:val="22"/>
+        </w:rPr>
+      </w:r>
+    </w:p>
+    <w:p>
+      <w:pPr>
+        <w:spacing w:after="80"/>
+        <w:jc w:val="center"/>
+      </w:pPr>
+      <w:r>
+        <w:rPr>
+          <w:rFonts w:ascii="Calibri" w:hAnsi="Calibri"/>
+          <w:b/>
+          <w:color w:val="0B2545"/>
+          <w:sz w:val="22"/>
+        </w:rPr>
+        <w:t>Program: CWRU 2026 Sponsored Summer Research Program</w:t>
       </w:r>
       <w:r>
         <w:rPr>

</xml_diff>